<commit_message>
refactor(ingenieria-desarrollo-movil): proyecto de aula (FO-IV-159) en lugar de ABP
Guía, plantillas con el formato FO-IV-159, presentación y unidades corregidas; menos recuadros
con emoji; las rutas abp/ redirigen a proyecto-aula/.

Co-Authored-By: Claude Opus 5.5 <noreply@anthropic.com>
</commit_message>
<xml_diff>
--- a/2026-B/ingenieria-desarrollo-movil/unidad-01/optional-activity/pdf/Practica-Unidad01.docx
+++ b/2026-B/ingenieria-desarrollo-movil/unidad-01/optional-activity/pdf/Practica-Unidad01.docx
@@ -604,7 +604,7 @@
           <w:sz w:val="22"/>
           <w:szCs w:val="22"/>
         </w:rPr>
-        <w:t xml:space="preserve">. Si ya tienes pareja del ABP, háganla juntos y sobre su propio problema; si no, hazla sobre el problema que piensas proponer. Tiempo estimado: tres a cuatro horas. Nada es un ejercicio aparte: son las primeras piezas de las secciones </w:t>
+        <w:t xml:space="preserve">. Si ya tienes pareja del proyecto de aula, háganla juntos y sobre su propio problema; si no, hazla sobre el problema que piensas proponer. Tiempo estimado: tres a cuatro horas. Nada es un ejercicio aparte: son las primeras piezas de las secciones </w:t>
       </w:r>
       <w:r>
         <w:rPr>
@@ -2044,7 +2044,7 @@
           <w:sz w:val="21"/>
           <w:szCs w:val="21"/>
         </w:rPr>
-        <w:t xml:space="preserve">Atención:</w:t>
+        <w:t xml:space="preserve">Cuidado:</w:t>
       </w:r>
       <w:r>
         <w:rPr>
@@ -2053,7 +2053,7 @@
           <w:sz w:val="21"/>
           <w:szCs w:val="21"/>
         </w:rPr>
-        <w:t xml:space="preserve"> «Es más barato» o «es lo que sabemos» no son veredictos. El veredicto se gana por descarte: muestra que ningún requisito de tu problema supera el techo del WebView. Si alguno lo supera (realidad aumentada, procesamiento de video en tiempo real), acota el alcance del problema para el ABP y deja escrito qué quedó por fuera y por qué.</w:t>
+        <w:t xml:space="preserve"> «Es más barato» o «es lo que sabemos» no son veredictos. El veredicto se gana por descarte: muestra que ningún requisito de tu problema supera el techo del WebView. Si alguno lo supera (realidad aumentada, procesamiento de video en tiempo real), acota el alcance del problema para el proyecto de aula y deja escrito qué quedó por fuera y por qué.</w:t>
       </w:r>
     </w:p>
     <w:p>
@@ -2948,26 +2948,25 @@
     </w:p>
     <w:p>
       <w:pPr>
-        <w:spacing w:before="120" w:after="120" w:line="276" w:lineRule="auto"/>
-        <w:ind w:left="120"/>
-        <w:shd w:val="clear" w:color="auto" w:fill="E9F7EF"/>
+        <w:spacing w:after="120" w:line="276" w:lineRule="auto"/>
+        <w:jc w:val="both"/>
       </w:pPr>
       <w:r>
         <w:rPr>
           <w:rFonts w:ascii="Times New Roman" w:hAnsi="Times New Roman" w:cs="Times New Roman"/>
           <w:b/>
           <w:color w:val="000000"/>
-          <w:sz w:val="21"/>
-          <w:szCs w:val="21"/>
-        </w:rPr>
-        <w:t xml:space="preserve">Consejo:</w:t>
-      </w:r>
-      <w:r>
-        <w:rPr>
-          <w:rFonts w:ascii="Times New Roman" w:hAnsi="Times New Roman" w:cs="Times New Roman"/>
-          <w:color w:val="000000"/>
-          <w:sz w:val="21"/>
-          <w:szCs w:val="21"/>
+          <w:sz w:val="22"/>
+          <w:szCs w:val="22"/>
+        </w:rPr>
+        <w:t xml:space="preserve">Consejo.</w:t>
+      </w:r>
+      <w:r>
+        <w:rPr>
+          <w:rFonts w:ascii="Times New Roman" w:hAnsi="Times New Roman" w:cs="Times New Roman"/>
+          <w:color w:val="000000"/>
+          <w:sz w:val="22"/>
+          <w:szCs w:val="22"/>
         </w:rPr>
         <w:t xml:space="preserve"> En la Unidad 2 este repositorio en memoria se reemplaza por uno HTTP con caché cambiando </w:t>
       </w:r>
@@ -2976,8 +2975,8 @@
           <w:rFonts w:ascii="Times New Roman" w:hAnsi="Times New Roman" w:cs="Times New Roman"/>
           <w:b/>
           <w:color w:val="000000"/>
-          <w:sz w:val="21"/>
-          <w:szCs w:val="21"/>
+          <w:sz w:val="22"/>
+          <w:szCs w:val="22"/>
         </w:rPr>
         <w:t xml:space="preserve">una línea</w:t>
       </w:r>
@@ -2985,8 +2984,8 @@
         <w:rPr>
           <w:rFonts w:ascii="Times New Roman" w:hAnsi="Times New Roman" w:cs="Times New Roman"/>
           <w:color w:val="000000"/>
-          <w:sz w:val="21"/>
-          <w:szCs w:val="21"/>
+          <w:sz w:val="22"/>
+          <w:szCs w:val="22"/>
         </w:rPr>
         <w:t xml:space="preserve"> de </w:t>
       </w:r>
@@ -2994,8 +2993,8 @@
         <w:rPr>
           <w:rFonts w:ascii="Consolas" w:hAnsi="Consolas" w:cs="Consolas"/>
           <w:color w:val="000000"/>
-          <w:sz w:val="21"/>
-          <w:szCs w:val="21"/>
+          <w:sz w:val="22"/>
+          <w:szCs w:val="22"/>
         </w:rPr>
         <w:t xml:space="preserve">core/di/</w:t>
       </w:r>
@@ -3003,8 +3002,8 @@
         <w:rPr>
           <w:rFonts w:ascii="Times New Roman" w:hAnsi="Times New Roman" w:cs="Times New Roman"/>
           <w:color w:val="000000"/>
-          <w:sz w:val="21"/>
-          <w:szCs w:val="21"/>
+          <w:sz w:val="22"/>
+          <w:szCs w:val="22"/>
         </w:rPr>
         <w:t xml:space="preserve">. Si para hacer ese cambio tuvieras que tocar la página, la Parte B todavía no cumple la regla de dependencias.</w:t>
       </w:r>
@@ -3068,7 +3067,7 @@
           <w:sz w:val="22"/>
           <w:szCs w:val="22"/>
         </w:rPr>
-        <w:t xml:space="preserve"> de [Plantillas del proyecto](https://code-corhuila.github.io/ova-web/2026-B/ingenieria-desarrollo-movil/abp/plantillas/), cópiala como </w:t>
+        <w:t xml:space="preserve"> de [Plantillas del proyecto](https://code-corhuila.github.io/ova-web/2026-B/ingenieria-desarrollo-movil/proyecto-aula/plantillas/), cópiala como </w:t>
       </w:r>
       <w:r>
         <w:rPr>
@@ -3403,7 +3402,7 @@
           <w:sz w:val="21"/>
           <w:szCs w:val="21"/>
         </w:rPr>
-        <w:t xml:space="preserve">Atención:</w:t>
+        <w:t xml:space="preserve">Cuidado:</w:t>
       </w:r>
       <w:r>
         <w:rPr>
@@ -3820,26 +3819,25 @@
     </w:p>
     <w:p>
       <w:pPr>
-        <w:spacing w:before="120" w:after="120" w:line="276" w:lineRule="auto"/>
-        <w:ind w:left="120"/>
-        <w:shd w:val="clear" w:color="auto" w:fill="E9F7EF"/>
+        <w:spacing w:after="120" w:line="276" w:lineRule="auto"/>
+        <w:jc w:val="both"/>
       </w:pPr>
       <w:r>
         <w:rPr>
           <w:rFonts w:ascii="Times New Roman" w:hAnsi="Times New Roman" w:cs="Times New Roman"/>
           <w:b/>
           <w:color w:val="000000"/>
-          <w:sz w:val="21"/>
-          <w:szCs w:val="21"/>
-        </w:rPr>
-        <w:t xml:space="preserve">Consejo:</w:t>
-      </w:r>
-      <w:r>
-        <w:rPr>
-          <w:rFonts w:ascii="Times New Roman" w:hAnsi="Times New Roman" w:cs="Times New Roman"/>
-          <w:color w:val="000000"/>
-          <w:sz w:val="21"/>
-          <w:szCs w:val="21"/>
+          <w:sz w:val="22"/>
+          <w:szCs w:val="22"/>
+        </w:rPr>
+        <w:t xml:space="preserve">Consejo.</w:t>
+      </w:r>
+      <w:r>
+        <w:rPr>
+          <w:rFonts w:ascii="Times New Roman" w:hAnsi="Times New Roman" w:cs="Times New Roman"/>
+          <w:color w:val="000000"/>
+          <w:sz w:val="22"/>
+          <w:szCs w:val="22"/>
         </w:rPr>
         <w:t xml:space="preserve"> Si el diagrama de contexto necesita más de siete u ocho cajas, probablemente estás mezclando niveles: los contenedores (app, API, base de datos) van en el nivel 2.</w:t>
       </w:r>
@@ -4773,7 +4771,7 @@
           <w:sz w:val="21"/>
           <w:szCs w:val="21"/>
         </w:rPr>
-        <w:t xml:space="preserve"> en el Encuentro 2 (viernes 16 de octubre, 6:00 – 7:00 p. m., [meet.google.com/pzh-kxer-pnx](https://meet.google.com/pzh-kxer-pnx)). Guía del hito: [Guía del proyecto ABP](https://code-corhuila.github.io/ova-web/2026-B/ingenieria-desarrollo-movil/abp/guia/).</w:t>
+        <w:t xml:space="preserve"> en el Encuentro 2 (viernes 16 de octubre, 6:00 – 7:00 p. m., [meet.google.com/pzh-kxer-pnx](https://meet.google.com/pzh-kxer-pnx)). Guía del hito: [Guía del proyecto de aula](https://code-corhuila.github.io/ova-web/2026-B/ingenieria-desarrollo-movil/proyecto-aula/guia/).</w:t>
       </w:r>
     </w:p>
     <w:p>
@@ -4783,36 +4781,16 @@
     </w:p>
     <w:p>
       <w:pPr>
-        <w:spacing w:before="120" w:after="120" w:line="276" w:lineRule="auto"/>
-        <w:ind w:left="120"/>
-        <w:shd w:val="clear" w:color="auto" w:fill="E9F7EF"/>
+        <w:spacing w:after="120" w:line="276" w:lineRule="auto"/>
+        <w:jc w:val="both"/>
       </w:pPr>
       <w:r>
         <w:rPr>
           <w:rFonts w:ascii="Times New Roman" w:hAnsi="Times New Roman" w:cs="Times New Roman"/>
           <w:b/>
           <w:color w:val="000000"/>
-          <w:sz w:val="21"/>
-          <w:szCs w:val="21"/>
-        </w:rPr>
-        <w:t xml:space="preserve">Nota:</w:t>
-      </w:r>
-      <w:r>
-        <w:rPr>
-          <w:rFonts w:ascii="Times New Roman" w:hAnsi="Times New Roman" w:cs="Times New Roman"/>
-          <w:color w:val="000000"/>
-          <w:sz w:val="21"/>
-          <w:szCs w:val="21"/>
-        </w:rPr>
-        <w:t xml:space="preserve"> </w:t>
-      </w:r>
-      <w:r>
-        <w:rPr>
-          <w:rFonts w:ascii="Times New Roman" w:hAnsi="Times New Roman" w:cs="Times New Roman"/>
-          <w:b/>
-          <w:color w:val="000000"/>
-          <w:sz w:val="21"/>
-          <w:szCs w:val="21"/>
+          <w:sz w:val="22"/>
+          <w:szCs w:val="22"/>
         </w:rPr>
         <w:t xml:space="preserve">Versión imprimible.</w:t>
       </w:r>
@@ -4820,8 +4798,8 @@
         <w:rPr>
           <w:rFonts w:ascii="Times New Roman" w:hAnsi="Times New Roman" w:cs="Times New Roman"/>
           <w:color w:val="000000"/>
-          <w:sz w:val="21"/>
-          <w:szCs w:val="21"/>
+          <w:sz w:val="22"/>
+          <w:szCs w:val="22"/>
         </w:rPr>
         <w:t xml:space="preserve"> [Descarga esta práctica en PDF](pdf/Practica-Unidad01.pdf), con el membrete institucional.</w:t>
       </w:r>

</xml_diff>